<commit_message>
Update document conversion script to fix table formatting
Refactor the markdown-to-docx conversion script to correctly format table headers and cells, ensuring proper rendering of the St. David's LOI document.

Replit-Commit-Author: Agent
Replit-Commit-Session-Id: 8105c9d9-29eb-4730-9087-40eedcafe8c8
Replit-Commit-Checkpoint-Type: full_checkpoint
Replit-Commit-Event-Id: 9251d0de-eed9-4108-ba78-457f19d01ef8
Replit-Commit-Screenshot-Url: https://storage.googleapis.com/screenshot-production-us-central1/55376bb2-2aea-463e-b6a9-2c1d5c123d53/8105c9d9-29eb-4730-9087-40eedcafe8c8/GKEcJMW
Replit-Helium-Checkpoint-Created: true
</commit_message>
<xml_diff>
--- a/attached_assets/WAB2-LOI-RequestSummary-v7-FINAL.docx
+++ b/attached_assets/WAB2-LOI-RequestSummary-v7-FINAL.docx
@@ -98,7 +98,7 @@
         </w:rPr>
         <w:t xml:space="preserve"> </w:t>
       </w:r>
-      <w:hyperlink w:history="1" r:id="rIdpmu0wcbch4bszezw8-jeq">
+      <w:hyperlink w:history="1" r:id="rIdfim0jqcww67wn1gneiemd">
         <w:r>
           <w:rPr>
             <w:rStyle w:val="Hyperlink"/>
@@ -427,6 +427,9 @@
         <w:gridCol w:w="100"/>
       </w:tblGrid>
       <w:tr>
+        <w:trPr>
+          <w:tblHeader/>
+        </w:trPr>
         <w:tc>
           <w:tcPr>
             <w:tcW w:type="dxa" w:w="4500"/>
@@ -467,6 +470,9 @@
         </w:tc>
       </w:tr>
       <w:tr>
+        <w:trPr>
+          <w:tblHeader w:val="false"/>
+        </w:trPr>
         <w:tc>
           <w:tcPr>
             <w:tcW w:type="dxa" w:w="4500"/>
@@ -503,6 +509,9 @@
         </w:tc>
       </w:tr>
       <w:tr>
+        <w:trPr>
+          <w:tblHeader w:val="false"/>
+        </w:trPr>
         <w:tc>
           <w:tcPr>
             <w:tcW w:type="dxa" w:w="4500"/>
@@ -539,6 +548,9 @@
         </w:tc>
       </w:tr>
       <w:tr>
+        <w:trPr>
+          <w:tblHeader w:val="false"/>
+        </w:trPr>
         <w:tc>
           <w:tcPr>
             <w:tcW w:type="dxa" w:w="4500"/>
@@ -575,6 +587,9 @@
         </w:tc>
       </w:tr>
       <w:tr>
+        <w:trPr>
+          <w:tblHeader w:val="false"/>
+        </w:trPr>
         <w:tc>
           <w:tcPr>
             <w:tcW w:type="dxa" w:w="4500"/>
@@ -611,6 +626,9 @@
         </w:tc>
       </w:tr>
       <w:tr>
+        <w:trPr>
+          <w:tblHeader w:val="false"/>
+        </w:trPr>
         <w:tc>
           <w:tcPr>
             <w:tcW w:type="dxa" w:w="4500"/>
@@ -647,6 +665,9 @@
         </w:tc>
       </w:tr>
       <w:tr>
+        <w:trPr>
+          <w:tblHeader w:val="false"/>
+        </w:trPr>
         <w:tc>
           <w:tcPr>
             <w:tcW w:type="dxa" w:w="4500"/>
@@ -689,6 +710,9 @@
         </w:tc>
       </w:tr>
       <w:tr>
+        <w:trPr>
+          <w:tblHeader w:val="false"/>
+        </w:trPr>
         <w:tc>
           <w:tcPr>
             <w:tcW w:type="dxa" w:w="4500"/>
@@ -835,7 +859,7 @@
         </w:rPr>
         <w:t xml:space="preserve"> </w:t>
       </w:r>
-      <w:hyperlink w:history="1" r:id="rIdhrbx-dcei5oq8ockytldi">
+      <w:hyperlink w:history="1" r:id="rId5iwbwbc2qxxxx96egldmg">
         <w:r>
           <w:rPr>
             <w:rStyle w:val="Hyperlink"/>

</xml_diff>